<commit_message>
feat: refine lists, device info, params, threat alarm and message center
- Black/white list: cooperative targets, remove actions, live flight and command navigation
- Device info: archive card, deploy area select, camera seed data
- System params: control/safety/simulation groups and restore defaults
- Threat: rule priority field, sound alarm play modes and UI flash options
- Message center: device status online/offline events
- Data screen: floating object list label and refreshed prototype assets
- Flight record module and 3D map design artifacts

Co-authored-by: Cursor <cursoragent@cursor.com>
</commit_message>
<xml_diff>
--- a/public/export-templates/历史事件.docx
+++ b/public/export-templates/历史事件.docx
@@ -240,6 +240,71 @@
                 <w:sz w:val="21"/>
               </w:rPr>
               <w:t>名单归属，与列表页名单类型一致</w:t>
+            </w:r>
+          </w:p>
+        </w:tc>
+      </w:tr>
+      <w:tr>
+        <w:tc>
+          <w:tcPr>
+            <w:tcW w:type="dxa" w:w="3286"/>
+            <w:vAlign w:val="center"/>
+          </w:tcPr>
+          <w:p>
+            <w:pPr>
+              <w:jc w:val="left"/>
+            </w:pPr>
+            <w:r/>
+            <w:r>
+              <w:rPr>
+                <w:rFonts w:ascii="宋体" w:hAnsi="宋体" w:eastAsia="宋体"/>
+                <w:b/>
+                <w:color w:val="1F2937"/>
+                <w:sz w:val="21"/>
+              </w:rPr>
+              <w:t>目标类型</w:t>
+            </w:r>
+          </w:p>
+        </w:tc>
+        <w:tc>
+          <w:tcPr>
+            <w:tcW w:type="dxa" w:w="3286"/>
+            <w:vAlign w:val="center"/>
+          </w:tcPr>
+          <w:p>
+            <w:pPr>
+              <w:jc w:val="left"/>
+            </w:pPr>
+            <w:r/>
+            <w:r>
+              <w:rPr>
+                <w:rFonts w:ascii="宋体" w:hAnsi="宋体" w:eastAsia="宋体"/>
+                <w:b w:val="0"/>
+                <w:color w:val="1F2937"/>
+                <w:sz w:val="21"/>
+              </w:rPr>
+              <w:t>黑飞无人机 / 飞鸟 / 其他</w:t>
+            </w:r>
+          </w:p>
+        </w:tc>
+        <w:tc>
+          <w:tcPr>
+            <w:tcW w:type="dxa" w:w="3286"/>
+            <w:vAlign w:val="center"/>
+          </w:tcPr>
+          <w:p>
+            <w:pPr>
+              <w:jc w:val="left"/>
+            </w:pPr>
+            <w:r/>
+            <w:r>
+              <w:rPr>
+                <w:rFonts w:ascii="宋体" w:hAnsi="宋体" w:eastAsia="宋体"/>
+                <w:b w:val="0"/>
+                <w:color w:val="1F2937"/>
+                <w:sz w:val="21"/>
+              </w:rPr>
+              <w:t>历史事件目标类型，与列表页一致</w:t>
             </w:r>
           </w:p>
         </w:tc>
@@ -868,7 +933,7 @@
                 <w:color w:val="1F2937"/>
                 <w:sz w:val="21"/>
               </w:rPr>
-              <w:t>待处置 / 处置中 / 已处置 / 已结束</w:t>
+              <w:t>进行中 / 已结束</w:t>
             </w:r>
           </w:p>
         </w:tc>
@@ -889,7 +954,7 @@
                 <w:color w:val="1F2937"/>
                 <w:sz w:val="21"/>
               </w:rPr>
-              <w:t>事件处置状态</w:t>
+              <w:t>事件处置状态，与列表展示一致</w:t>
             </w:r>
           </w:p>
         </w:tc>
@@ -1048,6 +1113,28 @@
                 <w:color w:val="1F2937"/>
                 <w:sz w:val="21"/>
               </w:rPr>
+              <w:t>目标类型</w:t>
+            </w:r>
+          </w:p>
+        </w:tc>
+        <w:tc>
+          <w:tcPr>
+            <w:tcW w:type="dxa" w:w="1643"/>
+            <w:shd w:fill="E2E8F0"/>
+            <w:vAlign w:val="center"/>
+          </w:tcPr>
+          <w:p>
+            <w:pPr>
+              <w:jc w:val="center"/>
+            </w:pPr>
+            <w:r/>
+            <w:r>
+              <w:rPr>
+                <w:rFonts w:ascii="宋体" w:hAnsi="宋体" w:eastAsia="宋体"/>
+                <w:b/>
+                <w:color w:val="1F2937"/>
+                <w:sz w:val="21"/>
+              </w:rPr>
               <w:t>发现时间</w:t>
             </w:r>
           </w:p>
@@ -1096,28 +1183,6 @@
             </w:r>
           </w:p>
         </w:tc>
-        <w:tc>
-          <w:tcPr>
-            <w:tcW w:type="dxa" w:w="1643"/>
-            <w:shd w:fill="E2E8F0"/>
-            <w:vAlign w:val="center"/>
-          </w:tcPr>
-          <w:p>
-            <w:pPr>
-              <w:jc w:val="center"/>
-            </w:pPr>
-            <w:r/>
-            <w:r>
-              <w:rPr>
-                <w:rFonts w:ascii="宋体" w:hAnsi="宋体" w:eastAsia="宋体"/>
-                <w:b/>
-                <w:color w:val="1F2937"/>
-                <w:sz w:val="21"/>
-              </w:rPr>
-              <w:t>目标型号</w:t>
-            </w:r>
-          </w:p>
-        </w:tc>
       </w:tr>
       <w:tr>
         <w:tc>
@@ -1159,6 +1224,27 @@
                 <w:sz w:val="21"/>
               </w:rPr>
               <w:t>黑名单</w:t>
+            </w:r>
+          </w:p>
+        </w:tc>
+        <w:tc>
+          <w:tcPr>
+            <w:tcW w:type="dxa" w:w="1643"/>
+            <w:vAlign w:val="center"/>
+          </w:tcPr>
+          <w:p>
+            <w:pPr>
+              <w:jc w:val="center"/>
+            </w:pPr>
+            <w:r/>
+            <w:r>
+              <w:rPr>
+                <w:rFonts w:ascii="宋体" w:hAnsi="宋体" w:eastAsia="宋体"/>
+                <w:b w:val="0"/>
+                <w:color w:val="1F2937"/>
+                <w:sz w:val="21"/>
+              </w:rPr>
+              <w:t>黑飞无人机</w:t>
             </w:r>
           </w:p>
         </w:tc>
@@ -1225,27 +1311,6 @@
             </w:r>
           </w:p>
         </w:tc>
-        <w:tc>
-          <w:tcPr>
-            <w:tcW w:type="dxa" w:w="1643"/>
-            <w:vAlign w:val="center"/>
-          </w:tcPr>
-          <w:p>
-            <w:pPr>
-              <w:jc w:val="center"/>
-            </w:pPr>
-            <w:r/>
-            <w:r>
-              <w:rPr>
-                <w:rFonts w:ascii="宋体" w:hAnsi="宋体" w:eastAsia="宋体"/>
-                <w:b w:val="0"/>
-                <w:color w:val="1F2937"/>
-                <w:sz w:val="21"/>
-              </w:rPr>
-              <w:t>DJI Mavic 3</w:t>
-            </w:r>
-          </w:p>
-        </w:tc>
       </w:tr>
     </w:tbl>
     <w:p>
@@ -1254,7 +1319,7 @@
           <w:rFonts w:ascii="宋体" w:hAnsi="宋体" w:eastAsia="宋体"/>
           <w:sz w:val="20"/>
         </w:rPr>
-        <w:t>说明：Excel 导出包含全部 18 个字段；Word 导出写入完整数据表。字段顺序与历史事件模块当前实现保持一致。</w:t>
+        <w:t>说明：Excel / Word 导出均包含全部字段；字段顺序与历史事件列表保持一致。</w:t>
       </w:r>
     </w:p>
     <w:sectPr>

</xml_diff>